<commit_message>
Attribute Salesforce A/B-testing advisory to Wix; confirm Checkr in-office fit
Josh confirmed the Salesforce workflow A/B-testing advisory work happened
at Wix, so it moves from an unattributed profile note into a real
role-specific bullet on the Wix line, both in master-profile.md and the
Checkr resume. Also confirmed comfortable with Checkr's 3+ days/week
in-office cadence, closing the last open item on that application.

Co-Authored-By: Claude Sonnet 5 <noreply@anthropic.com>
Claude-Session: https://claude.ai/code/session_01DF84Bh4cXDnetBnrLWQPKU
</commit_message>
<xml_diff>
--- a/applications/checkr-business-systems-analyst-sales-ai-automation/Rotenberg Resume - Checkr - Business Systems Analyst Sales AI & Automation.docx
+++ b/applications/checkr-business-systems-analyst-sales-ai-automation/Rotenberg Resume - Checkr - Business Systems Analyst Sales AI & Automation.docx
@@ -501,6 +501,30 @@
           <w:i w:val="0"/>
           <w:color w:val="1A1A1A"/>
         </w:rPr>
+        <w:t>Advised on A/B testing strategy for a Salesforce-based workflow-automation effort, defining test structure and success criteria for the team building it.</w:t>
+      </w:r>
+    </w:p>
+    <w:p>
+      <w:pPr>
+        <w:spacing w:after="30"/>
+        <w:ind w:left="259" w:hanging="259"/>
+      </w:pPr>
+      <w:r>
+        <w:rPr>
+          <w:rFonts w:ascii="Calibri" w:hAnsi="Calibri"/>
+          <w:b w:val="0"/>
+          <w:i w:val="0"/>
+          <w:color w:val="163A5F"/>
+        </w:rPr>
+        <w:t xml:space="preserve">•  </w:t>
+      </w:r>
+      <w:r>
+        <w:rPr>
+          <w:rFonts w:ascii="Calibri" w:hAnsi="Calibri"/>
+          <w:b w:val="0"/>
+          <w:i w:val="0"/>
+          <w:color w:val="1A1A1A"/>
+        </w:rPr>
         <w:t>Labeled and defined the CRM fields required for outbound sales and onboarding workflows, standardizing data capture across the team.</w:t>
       </w:r>
     </w:p>

</xml_diff>